<commit_message>
Make site private: login required, allowed emails only
Remove offline/guest mode, restrict access to owner email only, disable auto-registration
</commit_message>
<xml_diff>
--- a/Vol.5 - 고관절/01단원_Anatomy_해부학.docx
+++ b/Vol.5 - 고관절/01단원_Anatomy_해부학.docx
@@ -7646,7 +7646,7 @@
           <w:sz w:val="22"/>
           <w:szCs w:val="22"/>
         </w:rPr>
-        <w:t xml:space="preserve">③</w:t>
+        <w:t>④</w:t>
       </w:r>
     </w:p>
     <w:p>
@@ -7675,7 +7675,7 @@
           <w:sz w:val="20"/>
           <w:szCs w:val="20"/>
         </w:rPr>
-        <w:t xml:space="preserve">비구에서 대퇴 골두와 접하는 부위는 반달공 형태로 변연이 두껍고 중앙은 비교적 얇다. 대퇴 골두는 비구에서와는 달리 내측이 두껍고 가장 자리로 갈수록 얇아진다 (내측 → 변연)</w:t>
+        <w:t>비구에서 대퇴 골두와 접하는 부위는 반달공 형태로 변연이 두껍고 중앙은 비교적 얇다. 대퇴 골두는 비구에서와는 달리 내측(중앙)이 두껍고 가장자리로 갈수록 얇아진다. 따라서 A=변연, B=중앙</w:t>
       </w:r>
     </w:p>
     <w:p>

</xml_diff>